<commit_message>
207-008: map Martabe detox analyser calibration to ReCYN tailing analyser 051-CA-002
Co-Authored-By: Claude Opus 5.5 <noreply@anthropic.com>
Claude-Session: https://claude.ai/code/session_01UHnSDEBA56GANs2gfXuK2P
</commit_message>
<xml_diff>
--- a/SWI/207-Automatic-Samplers-and-Analysers/MM-4034-033-OR-03-SWI-PRO-MET-207-008-Cyanide-Analyser-Calibration-and-Standardisation-RevA.docx
+++ b/SWI/207-Automatic-Samplers-and-Analysers/MM-4034-033-OR-03-SWI-PRO-MET-207-008-Cyanide-Analyser-Calibration-and-Standardisation-RevA.docx
@@ -1864,7 +1864,7 @@
                 <w:sz w:val="20"/>
                 <w:szCs w:val="20"/>
               </w:rPr>
-              <w:t xml:space="preserve">Calibrate and standardise the online cyanide analysers against known standards.</w:t>
+              <w:t xml:space="preserve">Calibrate and standardise the online cyanide analysers against known standards: the CIL circuit analyser 032-CA-001 (Steps 2 to 5) and the ReCYN tailing analyser 051-CA-002 (Step 6).</w:t>
             </w:r>
           </w:p>
           <w:p>
@@ -1932,7 +1932,7 @@
                 <w:sz w:val="20"/>
                 <w:szCs w:val="20"/>
               </w:rPr>
-              <w:t xml:space="preserve">051-CA-002 - Cyanide adsorption (ReCYN) online cyanide analyser (pH, free cyanide and WAD cyanide)</w:t>
+              <w:t xml:space="preserve">051-CA-002 - ReCYN tailing online cyanide analyser (pH, free cyanide and WAD cyanide)</w:t>
             </w:r>
           </w:p>
           <w:p>
@@ -2026,7 +2026,7 @@
                 <w:sz w:val="20"/>
                 <w:szCs w:val="20"/>
               </w:rPr>
-              <w:t xml:space="preserve">Draft for review: the calibration method (Steps 2 to 5) is taken from the Martabe work instruction Leach Analyzer Calibration (DOC-3-MET-PMC-WIN-00126-IE, v1.0, 25/12/2024) and applies to both analysers. The Martabe Detox Analyser Calibration is not used: there is no detox circuit at Mt. Morgan - the ReCYN circuit follows CIL. JSEA-PRO-MET-207-008 must be updated for the added hazard before this instruction is approved.</w:t>
+              <w:t xml:space="preserve">Draft for review: Steps 2 to 5 (032-CA-001) are taken from the Martabe work instruction Leach Analyzer Calibration (DOC-3-MET-PMC-WIN-00126-IE). Step 6 (051-CA-002) is taken from the Martabe Detox Analyser Calibration (DOC-3-MET-PMC-WIN-00117-IE): Mt. Morgan has no detox circuit - the ReCYN circuit follows CIL - so the Martabe detox analyser maps to the ReCYN tailing analyser 051-CA-002. Both v1.0, 25/12/2024. JSEA-PRO-MET-207-008 must be updated for the added hazards before this instruction is approved.</w:t>
             </w:r>
           </w:p>
           <w:p>
@@ -2051,7 +2051,7 @@
                 <w:sz w:val="20"/>
                 <w:szCs w:val="20"/>
               </w:rPr>
-              <w:t xml:space="preserve">Open items: (1) the source calibrates free NaCN only, with the WAD calibration box NOT ticked; the Mt. Morgan analysers read free and WAD cyanide, so the WAD calibration must be set from the Cynoprobe v3 WAD calibration data, which is not held; (2) standards - the Indonesian source gives 250, 500 and 700 ppm NaCN, its English copy 30, 250 and 500 ppm (taken from the detox instruction); confirm the leach standards and set the range for 051-CA-002 on the ReCYN circuit; (3) the source verification pH range of 9 to 11 reaches below the 10.5 cyanide safety limit; (4) the troubleshooting guide for critical errors is an attachment that was not received; (5) confirm the cyanide-bearing return point for leftover standard (the source says the leach tank) and the record folders.</w:t>
+              <w:t xml:space="preserve">Open items: (1) the source calibrates free NaCN only, with the WAD calibration box NOT ticked; the Mt. Morgan analysers read free and WAD cyanide, so the WAD calibration must be set from the Cynoprobe v3 WAD calibration data, which is not held; (2) standards for 032-CA-001 - the Indonesian source gives 250, 500 and 700 ppm NaCN, its English copy 30, 250 and 500 ppm; confirm; (3) standards for 051-CA-002 - the source materials list gives 30, 125 and 250 ppm, the steps give 30, 250 and 500 ppm; confirm against the ReCYN tailing range; (4) verification pH ranges in the source (9 to 11 for the leach analyser, 6 to 9 for the detox stream) reach below the 10.5 cyanide safety limit; confirm the range for each stream, in particular the ReCYN tailing; (5) the troubleshooting guide for critical errors is an attachment that was not received; (6) confirm the cyanide-bearing return point for leftover standard (the source says the leach tank) and the record folders.</w:t>
             </w:r>
           </w:p>
           <w:p>
@@ -2272,6 +2272,29 @@
                 <w:szCs w:val="20"/>
               </w:rPr>
               <w:t xml:space="preserve">[JSEA to confirm] Cyanide standards (2 L bottles) carried to the analyser hut; eye splash; stairs to the hut — Standards carried in lidded dark bottles inside a second plastic bag. Nitrile or latex gloves, glasses and the gas mask with A2B2E2K2P3 cartridge available. Safety data sheet read; eyewash proven flowing; spill kit at hand; pour slowly; clean spills at once. Poisoning or breathing difficulty: clinic or the emergency response team at once. Stairs with chains and handrails in place and three points of contact.</w:t>
+            </w:r>
+          </w:p>
+          <w:p>
+            <w:pPr>
+              <w:rPr>
+                <w:sz w:val="20"/>
+                <w:szCs w:val="20"/>
+              </w:rPr>
+            </w:pPr>
+          </w:p>
+          <w:p>
+            <w:pPr>
+              <w:rPr>
+                <w:sz w:val="20"/>
+                <w:szCs w:val="20"/>
+              </w:rPr>
+            </w:pPr>
+            <w:r>
+              <w:rPr>
+                <w:sz w:val="20"/>
+                <w:szCs w:val="20"/>
+              </w:rPr>
+              <w:t xml:space="preserve">[JSEA to confirm] Hand trapped at the ReCYN tailing analyser (051-CA-002) cover, and spilled standard to the skin or eyes — Latex gloves, glasses, gas mask and safety boots; keep hands clear of the cover pinch point and a safe distance. Spill kit at hand; clean spills at once with running water. HCN poisoning: clinic or the emergency response team at once.</w:t>
             </w:r>
           </w:p>
           <w:p>
@@ -4054,7 +4077,7 @@
                 <w:lang w:val="en-AU" w:eastAsia="en-AU"/>
                 <w14:ligatures w14:val="none"/>
               </w:rPr>
-              <w:t xml:space="preserve">NaCN standards at 3 levels, 2 L each, from the Mt. Morgan laboratory</w:t>
+              <w:t xml:space="preserve">NaCN standards at 3 levels, 2 L each, from the Mt. Morgan laboratory, for each analyser</w:t>
             </w:r>
           </w:p>
           <w:p>
@@ -4256,7 +4279,7 @@
                 <w:sz w:val="16"/>
                 <w:szCs w:val="16"/>
               </w:rPr>
-              <w:t xml:space="preserve">Standards and Titration</w:t>
+              <w:t xml:space="preserve">Standards and Titration - 032-CA-001</w:t>
             </w:r>
           </w:p>
           <w:p>
@@ -4724,7 +4747,7 @@
                 <w:sz w:val="16"/>
                 <w:szCs w:val="16"/>
               </w:rPr>
-              <w:t xml:space="preserve">Calibration Wizard</w:t>
+              <w:t xml:space="preserve">Calibration Wizard - 032-CA-001</w:t>
             </w:r>
           </w:p>
           <w:p>
@@ -5131,7 +5154,7 @@
                 <w:sz w:val="16"/>
                 <w:szCs w:val="16"/>
               </w:rPr>
-              <w:t xml:space="preserve">Acceptance and Verification</w:t>
+              <w:t xml:space="preserve">Acceptance and Verification - 032-CA-001</w:t>
             </w:r>
           </w:p>
           <w:p>
@@ -5332,7 +5355,7 @@
                 <w:lang w:val="en-AU" w:eastAsia="en-AU"/>
                 <w14:ligatures w14:val="none"/>
               </w:rPr>
-              <w:t xml:space="preserve">Tell the control room the calibration is finished. Record the before and after readings in G:\\Processing\\5. Metallurgy\\Metallurgy Lab\\04 Metlab Data\\Calibration Logsheet\\Logsheet Cyanide Analyzer Calibration or on form DOC-4-MET-PMC-DFR-00136-EN (Form Cyanide Analyzer Calibration.xlsx).</w:t>
+              <w:t xml:space="preserve">Tell the control room the calibration is finished. Record the before and after readings in G:\Processing\5. Metallurgy\Metallurgy Lab\04 Metlab Data\Calibration Logsheet\Logsheet Cyanide Analyzer Calibration or on form DOC-4-MET-PMC-DFR-00136-EN (Form Cyanide Analyzer Calibration.xlsx).</w:t>
             </w:r>
           </w:p>
           <w:p>
@@ -5447,7 +5470,7 @@
                 <w:sz w:val="16"/>
                 <w:szCs w:val="16"/>
               </w:rPr>
-              <w:t xml:space="preserve">Standards Clean-up</w:t>
+              <w:t xml:space="preserve">Standards Clean-up - 032-CA-001</w:t>
             </w:r>
           </w:p>
           <w:p>
@@ -5602,7 +5625,7 @@
                 <w:sz w:val="16"/>
                 <w:szCs w:val="16"/>
               </w:rPr>
-              <w:t xml:space="preserve">Completion and Clean Up</w:t>
+              <w:t xml:space="preserve">ReCYN Tailing Analyser Calibration - 051-CA-002</w:t>
             </w:r>
           </w:p>
           <w:p>
@@ -5633,7 +5656,7 @@
                 <w:sz w:val="16"/>
                 <w:szCs w:val="16"/>
               </w:rPr>
-              <w:t xml:space="preserve">Spillage left on the ground</w:t>
+              <w:t xml:space="preserve">Hand trapped at the analyser cover</w:t>
             </w:r>
           </w:p>
           <w:p>
@@ -5665,7 +5688,7 @@
                 <w:sz w:val="16"/>
                 <w:szCs w:val="16"/>
               </w:rPr>
-              <w:t xml:space="preserve">Equipment not returned</w:t>
+              <w:t xml:space="preserve">Spilled standard to the skin or eyes</w:t>
             </w:r>
           </w:p>
           <w:p>
@@ -5685,6 +5708,518 @@
               <w:numPr>
                 <w:ilvl w:val="0"/>
                 <w:numId w:val="20"/>
+              </w:numPr>
+              <w:rPr>
+                <w:sz w:val="16"/>
+                <w:szCs w:val="16"/>
+                <w:lang w:val="en-AU"/>
+              </w:rPr>
+            </w:pPr>
+            <w:r>
+              <w:rPr>
+                <w:sz w:val="16"/>
+                <w:szCs w:val="16"/>
+              </w:rPr>
+              <w:t xml:space="preserve">Calibration accepted with poor fit</w:t>
+            </w:r>
+          </w:p>
+          <w:p>
+            <w:pPr>
+              <w:pStyle w:val="ListParagraph"/>
+              <w:ind w:left="360"/>
+              <w:rPr>
+                <w:sz w:val="16"/>
+                <w:szCs w:val="16"/>
+                <w:lang w:val="en-AU"/>
+              </w:rPr>
+            </w:pPr>
+          </w:p>
+          <w:p>
+            <w:pPr>
+              <w:pStyle w:val="ListParagraph"/>
+              <w:numPr>
+                <w:ilvl w:val="0"/>
+                <w:numId w:val="20"/>
+              </w:numPr>
+              <w:rPr>
+                <w:sz w:val="16"/>
+                <w:szCs w:val="16"/>
+                <w:lang w:val="en-AU"/>
+              </w:rPr>
+            </w:pPr>
+            <w:r>
+              <w:rPr>
+                <w:sz w:val="16"/>
+                <w:szCs w:val="16"/>
+              </w:rPr>
+              <w:t xml:space="preserve">pH reading below the cyanide safety limit</w:t>
+            </w:r>
+          </w:p>
+        </w:tc>
+        <w:tc>
+          <w:tcPr>
+            <w:tcW w:w="3998" w:type="dxa"/>
+            <w:gridSpan w:val="7"/>
+          </w:tcPr>
+          <w:p>
+            <w:pPr>
+              <w:pStyle w:val="ListParagraph"/>
+              <w:spacing w:before="100" w:beforeAutospacing="1" w:after="100" w:afterAutospacing="1"/>
+              <w:ind w:left="360"/>
+              <w:rPr>
+                <w:rFonts w:eastAsia="Times New Roman" w:cs="Times New Roman"/>
+                <w:kern w:val="0"/>
+                <w:sz w:val="16"/>
+                <w:szCs w:val="16"/>
+                <w:lang w:val="en-AU" w:eastAsia="en-AU"/>
+                <w14:ligatures w14:val="none"/>
+              </w:rPr>
+            </w:pPr>
+          </w:p>
+          <w:p>
+            <w:pPr>
+              <w:pStyle w:val="ListParagraph"/>
+              <w:numPr>
+                <w:ilvl w:val="0"/>
+                <w:numId w:val="4"/>
+              </w:numPr>
+              <w:spacing w:before="100" w:beforeAutospacing="1" w:after="100" w:afterAutospacing="1"/>
+              <w:rPr>
+                <w:rFonts w:eastAsia="Times New Roman" w:cs="Times New Roman"/>
+                <w:kern w:val="0"/>
+                <w:sz w:val="16"/>
+                <w:szCs w:val="16"/>
+                <w:lang w:val="en-AU" w:eastAsia="en-AU"/>
+                <w14:ligatures w14:val="none"/>
+              </w:rPr>
+            </w:pPr>
+            <w:r>
+              <w:rPr>
+                <w:rFonts w:eastAsia="Times New Roman" w:cs="Times New Roman"/>
+                <w:kern w:val="0"/>
+                <w:sz w:val="16"/>
+                <w:szCs w:val="16"/>
+                <w:lang w:val="en-AU" w:eastAsia="en-AU"/>
+                <w14:ligatures w14:val="none"/>
+              </w:rPr>
+              <w:t xml:space="preserve">Standards: 30, 250 and 500 ppm NaCN (see open item 3), 2 L each, from the laboratory, in dark lidded bottles inside a plastic bag. Confirm the eyewash at the ReCYN tailing analyser works and tell the control room the cyanide probe will be calibrated. Titrate each standard by hand 3 times (SWI-PRO-MET-205-001) and average the results.</w:t>
+            </w:r>
+          </w:p>
+          <w:p>
+            <w:pPr>
+              <w:pStyle w:val="ListParagraph"/>
+              <w:spacing w:before="100" w:beforeAutospacing="1" w:after="100" w:afterAutospacing="1"/>
+              <w:ind w:left="360"/>
+              <w:rPr>
+                <w:rFonts w:eastAsia="Times New Roman" w:cs="Times New Roman"/>
+                <w:kern w:val="0"/>
+                <w:sz w:val="16"/>
+                <w:szCs w:val="16"/>
+                <w:lang w:val="en-AU" w:eastAsia="en-AU"/>
+                <w14:ligatures w14:val="none"/>
+              </w:rPr>
+            </w:pPr>
+          </w:p>
+          <w:p>
+            <w:pPr>
+              <w:pStyle w:val="ListParagraph"/>
+              <w:numPr>
+                <w:ilvl w:val="0"/>
+                <w:numId w:val="4"/>
+              </w:numPr>
+              <w:spacing w:before="100" w:beforeAutospacing="1" w:after="100" w:afterAutospacing="1"/>
+              <w:rPr>
+                <w:rFonts w:eastAsia="Times New Roman" w:cs="Times New Roman"/>
+                <w:kern w:val="0"/>
+                <w:sz w:val="16"/>
+                <w:szCs w:val="16"/>
+                <w:lang w:val="en-AU" w:eastAsia="en-AU"/>
+                <w14:ligatures w14:val="none"/>
+              </w:rPr>
+            </w:pPr>
+            <w:r>
+              <w:rPr>
+                <w:rFonts w:eastAsia="Times New Roman" w:cs="Times New Roman"/>
+                <w:kern w:val="0"/>
+                <w:sz w:val="16"/>
+                <w:szCs w:val="16"/>
+                <w:lang w:val="en-AU" w:eastAsia="en-AU"/>
+                <w14:ligatures w14:val="none"/>
+              </w:rPr>
+              <w:t xml:space="preserve">Before calibrating, measure and record the automatic reading and the manual cyanide result.</w:t>
+            </w:r>
+          </w:p>
+          <w:p>
+            <w:pPr>
+              <w:pStyle w:val="ListParagraph"/>
+              <w:spacing w:before="100" w:beforeAutospacing="1" w:after="100" w:afterAutospacing="1"/>
+              <w:ind w:left="360"/>
+              <w:rPr>
+                <w:rFonts w:eastAsia="Times New Roman" w:cs="Times New Roman"/>
+                <w:kern w:val="0"/>
+                <w:sz w:val="16"/>
+                <w:szCs w:val="16"/>
+                <w:lang w:val="en-AU" w:eastAsia="en-AU"/>
+                <w14:ligatures w14:val="none"/>
+              </w:rPr>
+            </w:pPr>
+          </w:p>
+          <w:p>
+            <w:pPr>
+              <w:pStyle w:val="ListParagraph"/>
+              <w:numPr>
+                <w:ilvl w:val="0"/>
+                <w:numId w:val="4"/>
+              </w:numPr>
+              <w:spacing w:before="100" w:beforeAutospacing="1" w:after="100" w:afterAutospacing="1"/>
+              <w:rPr>
+                <w:rFonts w:eastAsia="Times New Roman" w:cs="Times New Roman"/>
+                <w:kern w:val="0"/>
+                <w:sz w:val="16"/>
+                <w:szCs w:val="16"/>
+                <w:lang w:val="en-AU" w:eastAsia="en-AU"/>
+                <w14:ligatures w14:val="none"/>
+              </w:rPr>
+            </w:pPr>
+            <w:r>
+              <w:rPr>
+                <w:rFonts w:eastAsia="Times New Roman" w:cs="Times New Roman"/>
+                <w:kern w:val="0"/>
+                <w:sz w:val="16"/>
+                <w:szCs w:val="16"/>
+                <w:lang w:val="en-AU" w:eastAsia="en-AU"/>
+                <w14:ligatures w14:val="none"/>
+              </w:rPr>
+              <w:t xml:space="preserve">Open the analyser cover. Calibrate as Steps 3 and 4: calibration wizard, 3 points, WAD box NOT ticked (see open item 1), flushes between standards 4, flushes between samples 1, sample times 4, enter the average titrated value for each standard, dip the auxiliary line in each standard, remove odd readings, accept if R squared is above 0.99, record M and C before and after and R squared after.</w:t>
+            </w:r>
+          </w:p>
+          <w:p>
+            <w:pPr>
+              <w:pStyle w:val="ListParagraph"/>
+              <w:spacing w:before="100" w:beforeAutospacing="1" w:after="100" w:afterAutospacing="1"/>
+              <w:ind w:left="360"/>
+              <w:rPr>
+                <w:rFonts w:eastAsia="Times New Roman" w:cs="Times New Roman"/>
+                <w:kern w:val="0"/>
+                <w:sz w:val="16"/>
+                <w:szCs w:val="16"/>
+                <w:lang w:val="en-AU" w:eastAsia="en-AU"/>
+                <w14:ligatures w14:val="none"/>
+              </w:rPr>
+            </w:pPr>
+          </w:p>
+          <w:p>
+            <w:pPr>
+              <w:pStyle w:val="ListParagraph"/>
+              <w:numPr>
+                <w:ilvl w:val="0"/>
+                <w:numId w:val="4"/>
+              </w:numPr>
+              <w:spacing w:before="100" w:beforeAutospacing="1" w:after="100" w:afterAutospacing="1"/>
+              <w:rPr>
+                <w:rFonts w:eastAsia="Times New Roman" w:cs="Times New Roman"/>
+                <w:kern w:val="0"/>
+                <w:sz w:val="16"/>
+                <w:szCs w:val="16"/>
+                <w:lang w:val="en-AU" w:eastAsia="en-AU"/>
+                <w14:ligatures w14:val="none"/>
+              </w:rPr>
+            </w:pPr>
+            <w:r>
+              <w:rPr>
+                <w:rFonts w:eastAsia="Times New Roman" w:cs="Times New Roman"/>
+                <w:kern w:val="0"/>
+                <w:sz w:val="16"/>
+                <w:szCs w:val="16"/>
+                <w:lang w:val="en-AU" w:eastAsia="en-AU"/>
+                <w14:ligatures w14:val="none"/>
+              </w:rPr>
+              <w:t xml:space="preserve">Open the cover of the analyser HMI screen. Check the automatic and manual NaCN agree within plus or minus 10 ppm; the filtrate temperature reads 25 to 40 degrees C; the analyser pH is in the range for the ReCYN tailing stream (source detox range 6 to 9 - see open item 4); the pH probe is immersed in the filtrate. If anything is abnormal, call the metallurgist.</w:t>
+            </w:r>
+          </w:p>
+          <w:p>
+            <w:pPr>
+              <w:pStyle w:val="ListParagraph"/>
+              <w:spacing w:before="100" w:beforeAutospacing="1" w:after="100" w:afterAutospacing="1"/>
+              <w:ind w:left="360"/>
+              <w:rPr>
+                <w:rFonts w:eastAsia="Times New Roman" w:cs="Times New Roman"/>
+                <w:kern w:val="0"/>
+                <w:sz w:val="16"/>
+                <w:szCs w:val="16"/>
+                <w:lang w:val="en-AU" w:eastAsia="en-AU"/>
+                <w14:ligatures w14:val="none"/>
+              </w:rPr>
+            </w:pPr>
+          </w:p>
+          <w:p>
+            <w:pPr>
+              <w:pStyle w:val="ListParagraph"/>
+              <w:numPr>
+                <w:ilvl w:val="0"/>
+                <w:numId w:val="4"/>
+              </w:numPr>
+              <w:spacing w:before="100" w:beforeAutospacing="1" w:after="100" w:afterAutospacing="1"/>
+              <w:rPr>
+                <w:rFonts w:eastAsia="Times New Roman" w:cs="Times New Roman"/>
+                <w:kern w:val="0"/>
+                <w:sz w:val="16"/>
+                <w:szCs w:val="16"/>
+                <w:lang w:val="en-AU" w:eastAsia="en-AU"/>
+                <w14:ligatures w14:val="none"/>
+              </w:rPr>
+            </w:pPr>
+            <w:r>
+              <w:rPr>
+                <w:rFonts w:eastAsia="Times New Roman" w:cs="Times New Roman"/>
+                <w:kern w:val="0"/>
+                <w:sz w:val="16"/>
+                <w:szCs w:val="16"/>
+                <w:lang w:val="en-AU" w:eastAsia="en-AU"/>
+                <w14:ligatures w14:val="none"/>
+              </w:rPr>
+              <w:t xml:space="preserve">Tell the control room the calibration is finished. Record the readings before and after in G:\Processing\5. Metallurgy\Metallurgy Lab\04 Metlab Data\Calibration Logsheet\Logsheet Detox Analyzer Calibration (source name) or on form DOC-4-MET-PMC-DFR-00138-EN (Form Detox Analyzer Calibration.xlsx).</w:t>
+            </w:r>
+          </w:p>
+          <w:p>
+            <w:pPr>
+              <w:pStyle w:val="ListParagraph"/>
+              <w:spacing w:before="100" w:beforeAutospacing="1" w:after="100" w:afterAutospacing="1"/>
+              <w:ind w:left="360"/>
+              <w:rPr>
+                <w:rFonts w:eastAsia="Times New Roman" w:cs="Times New Roman"/>
+                <w:kern w:val="0"/>
+                <w:sz w:val="16"/>
+                <w:szCs w:val="16"/>
+                <w:lang w:val="en-AU" w:eastAsia="en-AU"/>
+                <w14:ligatures w14:val="none"/>
+              </w:rPr>
+            </w:pPr>
+          </w:p>
+          <w:p>
+            <w:pPr>
+              <w:pStyle w:val="ListParagraph"/>
+              <w:numPr>
+                <w:ilvl w:val="0"/>
+                <w:numId w:val="4"/>
+              </w:numPr>
+              <w:spacing w:before="100" w:beforeAutospacing="1" w:after="100" w:afterAutospacing="1"/>
+              <w:rPr>
+                <w:rFonts w:eastAsia="Times New Roman" w:cs="Times New Roman"/>
+                <w:kern w:val="0"/>
+                <w:sz w:val="16"/>
+                <w:szCs w:val="16"/>
+                <w:lang w:val="en-AU" w:eastAsia="en-AU"/>
+                <w14:ligatures w14:val="none"/>
+              </w:rPr>
+            </w:pPr>
+            <w:r>
+              <w:rPr>
+                <w:rFonts w:eastAsia="Times New Roman" w:cs="Times New Roman"/>
+                <w:kern w:val="0"/>
+                <w:sz w:val="16"/>
+                <w:szCs w:val="16"/>
+                <w:lang w:val="en-AU" w:eastAsia="en-AU"/>
+                <w14:ligatures w14:val="none"/>
+              </w:rPr>
+              <w:t xml:space="preserve">Clean-up: pour all the remaining standard into the cyanide-bearing return point (the source says the leach tank). Wash the bottles with water and put them back in storage.</w:t>
+            </w:r>
+          </w:p>
+          <w:p>
+            <w:pPr>
+              <w:pStyle w:val="ListParagraph"/>
+              <w:spacing w:before="100" w:beforeAutospacing="1" w:after="100" w:afterAutospacing="1"/>
+              <w:ind w:left="360"/>
+              <w:rPr>
+                <w:rFonts w:eastAsia="Times New Roman" w:cs="Times New Roman"/>
+                <w:kern w:val="0"/>
+                <w:sz w:val="16"/>
+                <w:szCs w:val="16"/>
+                <w:lang w:val="en-AU" w:eastAsia="en-AU"/>
+                <w14:ligatures w14:val="none"/>
+              </w:rPr>
+            </w:pPr>
+          </w:p>
+          <w:p>
+            <w:pPr>
+              <w:jc w:val="center"/>
+              <w:rPr>
+                <w:rFonts w:eastAsia="Times New Roman" w:cs="Times New Roman"/>
+                <w:kern w:val="0"/>
+                <w:sz w:val="16"/>
+                <w:szCs w:val="16"/>
+                <w:lang w:val="en-AU" w:eastAsia="en-AU"/>
+                <w14:ligatures w14:val="none"/>
+              </w:rPr>
+            </w:pPr>
+            <w:r>
+              <w:rPr>
+                <w:rFonts w:eastAsia="Times New Roman" w:cs="Times New Roman"/>
+                <w:i/>
+                <w:iCs/>
+                <w:kern w:val="0"/>
+                <w:sz w:val="16"/>
+                <w:szCs w:val="16"/>
+                <w:lang w:val="en-AU" w:eastAsia="en-AU"/>
+                <w14:ligatures w14:val="none"/>
+              </w:rPr>
+              <w:t xml:space="preserve">CAUTION: Keep hands clear of the analyser cover pinch point. A ReCYN tailing stream below pH 10.5 can release HCN - keep the personal HCN monitor on.</w:t>
+            </w:r>
+          </w:p>
+          <w:p>
+            <w:pPr>
+              <w:pStyle w:val="ListParagraph"/>
+              <w:rPr>
+                <w:rFonts w:eastAsia="Times New Roman" w:cs="Times New Roman"/>
+                <w:i/>
+                <w:iCs/>
+                <w:kern w:val="0"/>
+                <w:sz w:val="16"/>
+                <w:szCs w:val="16"/>
+                <w:lang w:val="en-AU" w:eastAsia="en-AU"/>
+                <w14:ligatures w14:val="none"/>
+              </w:rPr>
+            </w:pPr>
+          </w:p>
+        </w:tc>
+        <w:tc>
+          <w:tcPr>
+            <w:tcW w:w="4729" w:type="dxa"/>
+            <w:gridSpan w:val="6"/>
+          </w:tcPr>
+          <w:p>
+            <w:pPr>
+              <w:jc w:val="center"/>
+              <w:rPr>
+                <w:sz w:val="20"/>
+                <w:szCs w:val="20"/>
+              </w:rPr>
+            </w:pPr>
+          </w:p>
+        </w:tc>
+      </w:tr>
+      <w:tr>
+        <w:tc>
+          <w:tcPr>
+            <w:tcW w:w="1905" w:type="dxa"/>
+            <w:gridSpan w:val="2"/>
+          </w:tcPr>
+          <w:p>
+            <w:pPr>
+              <w:pStyle w:val="ListParagraph"/>
+              <w:ind w:left="360"/>
+              <w:rPr>
+                <w:b/>
+                <w:bCs/>
+                <w:sz w:val="16"/>
+                <w:szCs w:val="16"/>
+              </w:rPr>
+            </w:pPr>
+          </w:p>
+          <w:p>
+            <w:pPr>
+              <w:pStyle w:val="ListParagraph"/>
+              <w:numPr>
+                <w:ilvl w:val="0"/>
+                <w:numId w:val="5"/>
+              </w:numPr>
+              <w:rPr>
+                <w:b/>
+                <w:bCs/>
+                <w:sz w:val="16"/>
+                <w:szCs w:val="16"/>
+              </w:rPr>
+            </w:pPr>
+            <w:r>
+              <w:rPr>
+                <w:b/>
+                <w:bCs/>
+                <w:sz w:val="16"/>
+                <w:szCs w:val="16"/>
+              </w:rPr>
+              <w:t xml:space="preserve">Completion and Clean Up</w:t>
+            </w:r>
+          </w:p>
+          <w:p>
+            <w:pPr>
+              <w:rPr>
+                <w:b/>
+                <w:bCs/>
+                <w:sz w:val="16"/>
+                <w:szCs w:val="16"/>
+              </w:rPr>
+            </w:pPr>
+          </w:p>
+          <w:p>
+            <w:pPr>
+              <w:pStyle w:val="ListParagraph"/>
+              <w:numPr>
+                <w:ilvl w:val="0"/>
+                <w:numId w:val="21"/>
+              </w:numPr>
+              <w:rPr>
+                <w:sz w:val="16"/>
+                <w:szCs w:val="16"/>
+                <w:lang w:val="en-AU"/>
+              </w:rPr>
+            </w:pPr>
+            <w:r>
+              <w:rPr>
+                <w:sz w:val="16"/>
+                <w:szCs w:val="16"/>
+              </w:rPr>
+              <w:t xml:space="preserve">Spillage left on the ground</w:t>
+            </w:r>
+          </w:p>
+          <w:p>
+            <w:pPr>
+              <w:pStyle w:val="ListParagraph"/>
+              <w:ind w:left="360"/>
+              <w:rPr>
+                <w:sz w:val="16"/>
+                <w:szCs w:val="16"/>
+                <w:lang w:val="en-AU"/>
+              </w:rPr>
+            </w:pPr>
+          </w:p>
+          <w:p>
+            <w:pPr>
+              <w:pStyle w:val="ListParagraph"/>
+              <w:numPr>
+                <w:ilvl w:val="0"/>
+                <w:numId w:val="21"/>
+              </w:numPr>
+              <w:rPr>
+                <w:sz w:val="16"/>
+                <w:szCs w:val="16"/>
+                <w:lang w:val="en-AU"/>
+              </w:rPr>
+            </w:pPr>
+            <w:r>
+              <w:rPr>
+                <w:sz w:val="16"/>
+                <w:szCs w:val="16"/>
+              </w:rPr>
+              <w:t xml:space="preserve">Equipment not returned</w:t>
+            </w:r>
+          </w:p>
+          <w:p>
+            <w:pPr>
+              <w:pStyle w:val="ListParagraph"/>
+              <w:ind w:left="360"/>
+              <w:rPr>
+                <w:sz w:val="16"/>
+                <w:szCs w:val="16"/>
+                <w:lang w:val="en-AU"/>
+              </w:rPr>
+            </w:pPr>
+          </w:p>
+          <w:p>
+            <w:pPr>
+              <w:pStyle w:val="ListParagraph"/>
+              <w:numPr>
+                <w:ilvl w:val="0"/>
+                <w:numId w:val="21"/>
               </w:numPr>
               <w:rPr>
                 <w:sz w:val="16"/>
@@ -6724,7 +7259,7 @@
                 <w:lang w:eastAsia="en-AU"/>
                 <w14:ligatures w14:val="none"/>
               </w:rPr>
-              <w:t xml:space="preserve">Martabe WI Leach Analyzer Calibration (25/12/2024) - source of Steps 2 to 5</w:t>
+              <w:t xml:space="preserve">Martabe WI Leach Analyzer Calibration (25/12/2024) - source of Steps 2 to 5 (032-CA-001)</w:t>
             </w:r>
           </w:p>
         </w:tc>
@@ -6768,7 +7303,7 @@
                 <w:lang w:eastAsia="en-AU"/>
                 <w14:ligatures w14:val="none"/>
               </w:rPr>
-              <w:t xml:space="preserve">DOC-2-MET-MEL-SOP-00087-IE and DOC-IV-MET-CHH-SOP-00039</w:t>
+              <w:t xml:space="preserve">DOC-3-MET-PMC-WIN-00117-IE v1.0</w:t>
             </w:r>
           </w:p>
         </w:tc>
@@ -6806,7 +7341,7 @@
                 <w:lang w:eastAsia="en-AU"/>
                 <w14:ligatures w14:val="none"/>
               </w:rPr>
-              <w:t xml:space="preserve">Martabe SOPs referenced by the Martabe WI - not received</w:t>
+              <w:t xml:space="preserve">Martabe WI Detox Analyser Calibration (25/12/2024) - source of Step 6 (051-CA-002, ReCYN tailing)</w:t>
             </w:r>
           </w:p>
         </w:tc>
@@ -6850,7 +7385,7 @@
                 <w:lang w:eastAsia="en-AU"/>
                 <w14:ligatures w14:val="none"/>
               </w:rPr>
-              <w:t xml:space="preserve">SWI-PRO-MET-205-001</w:t>
+              <w:t xml:space="preserve">DOC-2-MET-MEL-SOP-00087-IE and DOC-IV-MET-CHH-SOP-00039</w:t>
             </w:r>
           </w:p>
         </w:tc>
@@ -6888,7 +7423,7 @@
                 <w:lang w:eastAsia="en-AU"/>
                 <w14:ligatures w14:val="none"/>
               </w:rPr>
-              <w:t xml:space="preserve">Free Cyanide Titration - Silver Nitrate Method</w:t>
+              <w:t xml:space="preserve">Martabe SOPs referenced by the Martabe WIs - not received</w:t>
             </w:r>
           </w:p>
         </w:tc>
@@ -6932,7 +7467,7 @@
                 <w:lang w:eastAsia="en-AU"/>
                 <w14:ligatures w14:val="none"/>
               </w:rPr>
-              <w:t xml:space="preserve">DOC-4-MET-PMC-DFR-00136-EN</w:t>
+              <w:t xml:space="preserve">SWI-PRO-MET-205-001</w:t>
             </w:r>
           </w:p>
         </w:tc>
@@ -6970,7 +7505,89 @@
                 <w:lang w:eastAsia="en-AU"/>
                 <w14:ligatures w14:val="none"/>
               </w:rPr>
-              <w:t xml:space="preserve">Form Cyanide Analyzer Calibration</w:t>
+              <w:t xml:space="preserve">Free Cyanide Titration - Silver Nitrate Method</w:t>
+            </w:r>
+          </w:p>
+        </w:tc>
+      </w:tr>
+      <w:tr>
+        <w:trPr>
+          <w:cantSplit/>
+          <w:trHeight w:val="300"/>
+        </w:trPr>
+        <w:tc>
+          <w:tcPr>
+            <w:tcW w:w="4111" w:type="dxa"/>
+            <w:tcBorders>
+              <w:top w:val="single" w:sz="6" w:space="0" w:color="auto"/>
+              <w:left w:val="single" w:sz="6" w:space="0" w:color="auto"/>
+              <w:bottom w:val="single" w:sz="6" w:space="0" w:color="auto"/>
+              <w:right w:val="single" w:sz="6" w:space="0" w:color="auto"/>
+            </w:tcBorders>
+            <w:hideMark/>
+          </w:tcPr>
+          <w:p>
+            <w:pPr>
+              <w:keepNext/>
+              <w:spacing w:after="0" w:line="240" w:lineRule="auto"/>
+              <w:textAlignment w:val="baseline"/>
+              <w:rPr>
+                <w:rFonts w:ascii="Segoe UI" w:eastAsia="Times New Roman" w:hAnsi="Segoe UI" w:cs="Segoe UI"/>
+                <w:kern w:val="0"/>
+                <w:sz w:val="18"/>
+                <w:szCs w:val="18"/>
+                <w:lang w:val="en-AU" w:eastAsia="en-AU"/>
+                <w14:ligatures w14:val="none"/>
+              </w:rPr>
+            </w:pPr>
+            <w:r>
+              <w:rPr>
+                <w:rFonts w:ascii="Aptos" w:eastAsia="Times New Roman" w:hAnsi="Aptos" w:cs="Segoe UI"/>
+                <w:kern w:val="0"/>
+                <w:sz w:val="20"/>
+                <w:szCs w:val="20"/>
+                <w:lang w:eastAsia="en-AU"/>
+                <w14:ligatures w14:val="none"/>
+              </w:rPr>
+              <w:t xml:space="preserve">DOC-4-MET-PMC-DFR-00136-EN and 00138-EN</w:t>
+            </w:r>
+          </w:p>
+        </w:tc>
+        <w:tc>
+          <w:tcPr>
+            <w:tcW w:w="6521" w:type="dxa"/>
+            <w:tcBorders>
+              <w:top w:val="single" w:sz="6" w:space="0" w:color="auto"/>
+              <w:left w:val="single" w:sz="6" w:space="0" w:color="auto"/>
+              <w:bottom w:val="single" w:sz="6" w:space="0" w:color="auto"/>
+              <w:right w:val="single" w:sz="6" w:space="0" w:color="auto"/>
+            </w:tcBorders>
+            <w:hideMark/>
+          </w:tcPr>
+          <w:p>
+            <w:pPr>
+              <w:keepNext/>
+              <w:spacing w:after="0" w:line="240" w:lineRule="auto"/>
+              <w:textAlignment w:val="baseline"/>
+              <w:rPr>
+                <w:rFonts w:ascii="Segoe UI" w:eastAsia="Times New Roman" w:hAnsi="Segoe UI" w:cs="Segoe UI"/>
+                <w:kern w:val="0"/>
+                <w:sz w:val="18"/>
+                <w:szCs w:val="18"/>
+                <w:lang w:val="en-AU" w:eastAsia="en-AU"/>
+                <w14:ligatures w14:val="none"/>
+              </w:rPr>
+            </w:pPr>
+            <w:r>
+              <w:rPr>
+                <w:rFonts w:ascii="Aptos" w:eastAsia="Times New Roman" w:hAnsi="Aptos" w:cs="Segoe UI"/>
+                <w:kern w:val="0"/>
+                <w:sz w:val="20"/>
+                <w:szCs w:val="20"/>
+                <w:lang w:eastAsia="en-AU"/>
+                <w14:ligatures w14:val="none"/>
+              </w:rPr>
+              <w:t xml:space="preserve">Form Cyanide Analyzer Calibration and Form Detox Analyzer Calibration</w:t>
             </w:r>
           </w:p>
         </w:tc>
@@ -9945,6 +10562,12 @@
     </w:lvlOverride>
   </w:num>
   <w:num w:numId="20">
+    <w:abstractNumId w:val="9"/>
+    <w:lvlOverride w:ilvl="0">
+      <w:startOverride w:val="1"/>
+    </w:lvlOverride>
+  </w:num>
+  <w:num w:numId="21">
     <w:abstractNumId w:val="9"/>
     <w:lvlOverride w:ilvl="0">
       <w:startOverride w:val="1"/>

</xml_diff>